<commit_message>
feat: migracion a Supabase RAG + scrapers SII
</commit_message>
<xml_diff>
--- a/que_hacer_en_caso_de_una_citacion.docx
+++ b/que_hacer_en_caso_de_una_citacion.docx
@@ -7,8 +7,40 @@
         <w:pStyle w:val="Ttulo"/>
         <w:jc w:val="center"/>
       </w:pPr>
+      <w:proofErr w:type="spellStart"/>
       <w:r>
-        <w:t>que hacer en caso de una citacion</w:t>
+        <w:t>Q</w:t>
+      </w:r>
+      <w:r>
+        <w:t>ue</w:t>
+      </w:r>
+      <w:proofErr w:type="spellEnd"/>
+      <w:r>
+        <w:t xml:space="preserve"> </w:t>
+      </w:r>
+      <w:proofErr w:type="spellStart"/>
+      <w:r>
+        <w:t>hacer</w:t>
+      </w:r>
+      <w:proofErr w:type="spellEnd"/>
+      <w:r>
+        <w:t xml:space="preserve"> </w:t>
+      </w:r>
+      <w:proofErr w:type="spellStart"/>
+      <w:r>
+        <w:t>en</w:t>
+      </w:r>
+      <w:proofErr w:type="spellEnd"/>
+      <w:r>
+        <w:t xml:space="preserve"> </w:t>
+      </w:r>
+      <w:proofErr w:type="spellStart"/>
+      <w:r>
+        <w:t>caso</w:t>
+      </w:r>
+      <w:proofErr w:type="spellEnd"/>
+      <w:r>
+        <w:t xml:space="preserve"> de una citacion</w:t>
       </w:r>
     </w:p>
     <w:p>

</xml_diff>